<commit_message>
BD II Clase 2: teoria por slides, solucion completa y motor PostgreSQL
Co-Authored-By: Claude Opus 5 <noreply@anthropic.com>
</commit_message>
<xml_diff>
--- a/Bases de Datos II/Clases/Clase 2 - Administracion de bases de datos/Taller PI - Clase 2 - VetCare.docx
+++ b/Bases de Datos II/Clases/Clase 2 - Administracion de bases de datos/Taller PI - Clase 2 - VetCare.docx
@@ -56,7 +56,7 @@
           <w:color w:val="2B2B2B"/>
           <w:sz w:val="22"/>
         </w:rPr>
-        <w:t>Herramienta: Oracle Live SQL / DB Fiddle + Google Docs</w:t>
+        <w:t>Herramienta: ExamLab (PostgreSQL) + Google Docs</w:t>
       </w:r>
     </w:p>
     <w:p>
@@ -240,7 +240,7 @@
           <w:color w:val="2B2B2B"/>
           <w:sz w:val="22"/>
         </w:rPr>
-        <w:t>Definir &gt;=4 roles (ADMIN_BD, RECEPCION, VETERINARIO, AUDITOR).</w:t>
+        <w:t>Crear los 4 roles (admin_bd, recepcion, veterinario_rol, auditor) con GRANT/REVOKE que corran.</w:t>
       </w:r>
     </w:p>
     <w:p>
@@ -255,7 +255,7 @@
           <w:color w:val="2B2B2B"/>
           <w:sz w:val="22"/>
         </w:rPr>
-        <w:t>Matriz SELECT/INSERT/UPDATE/DELETE/EXECUTE por objeto clave.</w:t>
+        <w:t>Recortar la superficie: vista v_agenda_recepcion + privilegio por columna sobre dueno.</w:t>
       </w:r>
     </w:p>
     <w:p>
@@ -270,7 +270,7 @@
           <w:color w:val="2B2B2B"/>
           <w:sz w:val="22"/>
         </w:rPr>
-        <w:t>Justificar privilegio minimo (least privilege).</w:t>
+        <w:t>Matriz rol x objeto x privilegio de los 10 objetos, justificando privilegio minimo.</w:t>
       </w:r>
     </w:p>
     <w:p>
@@ -285,7 +285,7 @@
           <w:color w:val="2B2B2B"/>
           <w:sz w:val="22"/>
         </w:rPr>
-        <w:t>Redactar 1 pagina: politica de altas/bajas de usuarios.</w:t>
+        <w:t>Redactar 1 pagina: politica de altas/bajas de usuarios y limite del entorno.</w:t>
       </w:r>
     </w:p>
     <w:p>
@@ -314,7 +314,7 @@
           <w:color w:val="2B2B2B"/>
           <w:sz w:val="22"/>
         </w:rPr>
-        <w:t>Documento Roles_VetCare + script GRANT/REVOKE (o plan equivalente)</w:t>
+        <w:t>Documento Roles_VetCare + script GRANT/REVOKE ejecutado en ExamLab</w:t>
       </w:r>
     </w:p>
     <w:p>

</xml_diff>